<commit_message>
added data sheets to the repository as well as notes
</commit_message>
<xml_diff>
--- a/ADC_DRIVER_NOTES.docx
+++ b/ADC_DRIVER_NOTES.docx
@@ -3,11 +3,77 @@
 <w:document xmlns:wpc="http://schemas.microsoft.com/office/word/2010/wordprocessingCanvas" xmlns:cx="http://schemas.microsoft.com/office/drawing/2014/chartex" xmlns:cx1="http://schemas.microsoft.com/office/drawing/2015/9/8/chartex" xmlns:cx2="http://schemas.microsoft.com/office/drawing/2015/10/21/chartex" xmlns:cx3="http://schemas.microsoft.com/office/drawing/2016/5/9/chartex" xmlns:cx4="http://schemas.microsoft.com/office/drawing/2016/5/10/chartex" xmlns:cx5="http://schemas.microsoft.com/office/drawing/2016/5/11/chartex" xmlns:cx6="http://schemas.microsoft.com/office/drawing/2016/5/12/chartex" xmlns:cx7="http://schemas.microsoft.com/office/drawing/2016/5/13/chartex" xmlns:cx8="http://schemas.microsoft.com/office/drawing/2016/5/14/chartex" xmlns:mc="http://schemas.openxmlformats.org/markup-compatibility/2006" xmlns:aink="http://schemas.microsoft.com/office/drawing/2016/ink" xmlns:am3d="http://schemas.microsoft.com/office/drawing/2017/model3d" xmlns:o="urn:schemas-microsoft-com:office:office" xmlns:oel="http://schemas.microsoft.com/office/2019/extlst" xmlns:r="http://schemas.openxmlformats.org/officeDocument/2006/relationships" xmlns:m="http://schemas.openxmlformats.org/officeDocument/2006/math" xmlns:v="urn:schemas-microsoft-com:vml" xmlns:wp14="http://schemas.microsoft.com/office/word/2010/wordprocessingDrawing" xmlns:wp="http://schemas.openxmlformats.org/drawingml/2006/wordprocessingDrawing" xmlns:w10="urn:schemas-microsoft-com:office:word" xmlns:w="http://schemas.openxmlformats.org/wordprocessingml/2006/main" xmlns:w14="http://schemas.microsoft.com/office/word/2010/wordml" xmlns:w15="http://schemas.microsoft.com/office/word/2012/wordml" xmlns:w16cex="http://schemas.microsoft.com/office/word/2018/wordml/cex" xmlns:w16cid="http://schemas.microsoft.com/office/word/2016/wordml/cid" xmlns:w16="http://schemas.microsoft.com/office/word/2018/wordml" xmlns:w16sdtdh="http://schemas.microsoft.com/office/word/2020/wordml/sdtdatahash" xmlns:w16se="http://schemas.microsoft.com/office/word/2015/wordml/symex" xmlns:wpg="http://schemas.microsoft.com/office/word/2010/wordprocessingGroup" xmlns:wpi="http://schemas.microsoft.com/office/word/2010/wordprocessingInk" xmlns:wne="http://schemas.microsoft.com/office/word/2006/wordml" xmlns:wps="http://schemas.microsoft.com/office/word/2010/wordprocessingShape" mc:Ignorable="w14 w15 w16se w16cid w16 w16cex w16sdtdh wp14">
   <w:body>
     <w:p>
+      <w:pPr>
+        <w:pStyle w:val="Heading1"/>
+      </w:pPr>
       <w:r>
         <w:t>ANALOG TO DIGITAL CONVERSION STM32F7</w:t>
       </w:r>
     </w:p>
     <w:p/>
+    <w:p/>
+    <w:p>
+      <w:pPr>
+        <w:pStyle w:val="ListParagraph"/>
+        <w:numPr>
+          <w:ilvl w:val="0"/>
+          <w:numId w:val="1"/>
+        </w:numPr>
+      </w:pPr>
+      <w:r>
+        <w:t xml:space="preserve">The ADC input clock is generated from the PCLK2 clock divided by a </w:t>
+      </w:r>
+      <w:proofErr w:type="spellStart"/>
+      <w:r>
+        <w:t>prescaler</w:t>
+      </w:r>
+      <w:proofErr w:type="spellEnd"/>
+      <w:r>
+        <w:t xml:space="preserve"> and it must not exceed 14 </w:t>
+      </w:r>
+      <w:proofErr w:type="spellStart"/>
+      <w:r>
+        <w:t>MHz</w:t>
+      </w:r>
+      <w:r>
+        <w:t>.</w:t>
+      </w:r>
+      <w:proofErr w:type="spellEnd"/>
+    </w:p>
+    <w:p>
+      <w:pPr>
+        <w:pStyle w:val="Heading2"/>
+      </w:pPr>
+      <w:r>
+        <w:t>ADC TURNING ON</w:t>
+      </w:r>
+    </w:p>
+    <w:p>
+      <w:r>
+        <w:t>ADC on-off control The ADC is powered on by setting the ADON bit in the ADC_CR2 register. When the ADON bit is set for the first time, it wakes up the ADC from the Power-down mode. The conversion starts when either the SWSTART or the JSWSTART bit is set. The user can stop conversion and put the ADC in power down mode by clearing the ADON bit. In this mode the ADC consumes almost no power (only a few µA).</w:t>
+      </w:r>
+    </w:p>
+    <w:p>
+      <w:pPr>
+        <w:pStyle w:val="Heading2"/>
+      </w:pPr>
+      <w:r>
+        <w:t>ADC CLOCK</w:t>
+      </w:r>
+    </w:p>
+    <w:p>
+      <w:r>
+        <w:t xml:space="preserve">Clock for the analog circuitry: ADCCLK, common to all ADCs This clock is generated from the APB2 clock divided by a programmable </w:t>
+      </w:r>
+      <w:proofErr w:type="spellStart"/>
+      <w:r>
+        <w:t>prescaler</w:t>
+      </w:r>
+      <w:proofErr w:type="spellEnd"/>
+      <w:r>
+        <w:t xml:space="preserve"> that allows the ADC to work at fPCLK2/2, /4, /6 or /8. Refer to the datasheets for the maximum value of ADCCLK. • Clock for the digital interface (used for registers read/write access) This clock is equal to the APB2 clock. The digital interface clock can be enabled/disabled individually for each ADC through the RCC APB2 peripheral clock enable register (RCC_APB2ENR).</w:t>
+      </w:r>
+    </w:p>
     <w:sectPr>
       <w:pgSz w:w="12240" w:h="15840"/>
       <w:pgMar w:top="1440" w:right="1440" w:bottom="1440" w:left="1440" w:header="720" w:footer="720" w:gutter="0"/>
@@ -16,6 +82,100 @@
     </w:sectPr>
   </w:body>
 </w:document>
+</file>
+
+<file path=word/numbering.xml><?xml version="1.0" encoding="utf-8"?>
+<w:numbering xmlns:wpc="http://schemas.microsoft.com/office/word/2010/wordprocessingCanvas" xmlns:cx="http://schemas.microsoft.com/office/drawing/2014/chartex" xmlns:cx1="http://schemas.microsoft.com/office/drawing/2015/9/8/chartex" xmlns:cx2="http://schemas.microsoft.com/office/drawing/2015/10/21/chartex" xmlns:cx3="http://schemas.microsoft.com/office/drawing/2016/5/9/chartex" xmlns:cx4="http://schemas.microsoft.com/office/drawing/2016/5/10/chartex" xmlns:cx5="http://schemas.microsoft.com/office/drawing/2016/5/11/chartex" xmlns:cx6="http://schemas.microsoft.com/office/drawing/2016/5/12/chartex" xmlns:cx7="http://schemas.microsoft.com/office/drawing/2016/5/13/chartex" xmlns:cx8="http://schemas.microsoft.com/office/drawing/2016/5/14/chartex" xmlns:mc="http://schemas.openxmlformats.org/markup-compatibility/2006" xmlns:aink="http://schemas.microsoft.com/office/drawing/2016/ink" xmlns:am3d="http://schemas.microsoft.com/office/drawing/2017/model3d" xmlns:o="urn:schemas-microsoft-com:office:office" xmlns:oel="http://schemas.microsoft.com/office/2019/extlst" xmlns:r="http://schemas.openxmlformats.org/officeDocument/2006/relationships" xmlns:m="http://schemas.openxmlformats.org/officeDocument/2006/math" xmlns:v="urn:schemas-microsoft-com:vml" xmlns:wp14="http://schemas.microsoft.com/office/word/2010/wordprocessingDrawing" xmlns:wp="http://schemas.openxmlformats.org/drawingml/2006/wordprocessingDrawing" xmlns:w10="urn:schemas-microsoft-com:office:word" xmlns:w="http://schemas.openxmlformats.org/wordprocessingml/2006/main" xmlns:w14="http://schemas.microsoft.com/office/word/2010/wordml" xmlns:w15="http://schemas.microsoft.com/office/word/2012/wordml" xmlns:w16cex="http://schemas.microsoft.com/office/word/2018/wordml/cex" xmlns:w16cid="http://schemas.microsoft.com/office/word/2016/wordml/cid" xmlns:w16="http://schemas.microsoft.com/office/word/2018/wordml" xmlns:w16sdtdh="http://schemas.microsoft.com/office/word/2020/wordml/sdtdatahash" xmlns:w16se="http://schemas.microsoft.com/office/word/2015/wordml/symex" xmlns:wpg="http://schemas.microsoft.com/office/word/2010/wordprocessingGroup" xmlns:wpi="http://schemas.microsoft.com/office/word/2010/wordprocessingInk" xmlns:wne="http://schemas.microsoft.com/office/word/2006/wordml" xmlns:wps="http://schemas.microsoft.com/office/word/2010/wordprocessingShape" mc:Ignorable="w14 w15 w16se w16cid w16 w16cex w16sdtdh wp14">
+  <w:abstractNum w:abstractNumId="0" w15:restartNumberingAfterBreak="0">
+    <w:nsid w:val="3F7074B3"/>
+    <w:multiLevelType w:val="hybridMultilevel"/>
+    <w:tmpl w:val="9B14E462"/>
+    <w:lvl w:ilvl="0" w:tplc="0409000F">
+      <w:start w:val="1"/>
+      <w:numFmt w:val="decimal"/>
+      <w:lvlText w:val="%1."/>
+      <w:lvlJc w:val="left"/>
+      <w:pPr>
+        <w:ind w:left="720" w:hanging="360"/>
+      </w:pPr>
+    </w:lvl>
+    <w:lvl w:ilvl="1" w:tplc="04090019" w:tentative="1">
+      <w:start w:val="1"/>
+      <w:numFmt w:val="lowerLetter"/>
+      <w:lvlText w:val="%2."/>
+      <w:lvlJc w:val="left"/>
+      <w:pPr>
+        <w:ind w:left="1440" w:hanging="360"/>
+      </w:pPr>
+    </w:lvl>
+    <w:lvl w:ilvl="2" w:tplc="0409001B" w:tentative="1">
+      <w:start w:val="1"/>
+      <w:numFmt w:val="lowerRoman"/>
+      <w:lvlText w:val="%3."/>
+      <w:lvlJc w:val="right"/>
+      <w:pPr>
+        <w:ind w:left="2160" w:hanging="180"/>
+      </w:pPr>
+    </w:lvl>
+    <w:lvl w:ilvl="3" w:tplc="0409000F" w:tentative="1">
+      <w:start w:val="1"/>
+      <w:numFmt w:val="decimal"/>
+      <w:lvlText w:val="%4."/>
+      <w:lvlJc w:val="left"/>
+      <w:pPr>
+        <w:ind w:left="2880" w:hanging="360"/>
+      </w:pPr>
+    </w:lvl>
+    <w:lvl w:ilvl="4" w:tplc="04090019" w:tentative="1">
+      <w:start w:val="1"/>
+      <w:numFmt w:val="lowerLetter"/>
+      <w:lvlText w:val="%5."/>
+      <w:lvlJc w:val="left"/>
+      <w:pPr>
+        <w:ind w:left="3600" w:hanging="360"/>
+      </w:pPr>
+    </w:lvl>
+    <w:lvl w:ilvl="5" w:tplc="0409001B" w:tentative="1">
+      <w:start w:val="1"/>
+      <w:numFmt w:val="lowerRoman"/>
+      <w:lvlText w:val="%6."/>
+      <w:lvlJc w:val="right"/>
+      <w:pPr>
+        <w:ind w:left="4320" w:hanging="180"/>
+      </w:pPr>
+    </w:lvl>
+    <w:lvl w:ilvl="6" w:tplc="0409000F" w:tentative="1">
+      <w:start w:val="1"/>
+      <w:numFmt w:val="decimal"/>
+      <w:lvlText w:val="%7."/>
+      <w:lvlJc w:val="left"/>
+      <w:pPr>
+        <w:ind w:left="5040" w:hanging="360"/>
+      </w:pPr>
+    </w:lvl>
+    <w:lvl w:ilvl="7" w:tplc="04090019" w:tentative="1">
+      <w:start w:val="1"/>
+      <w:numFmt w:val="lowerLetter"/>
+      <w:lvlText w:val="%8."/>
+      <w:lvlJc w:val="left"/>
+      <w:pPr>
+        <w:ind w:left="5760" w:hanging="360"/>
+      </w:pPr>
+    </w:lvl>
+    <w:lvl w:ilvl="8" w:tplc="0409001B" w:tentative="1">
+      <w:start w:val="1"/>
+      <w:numFmt w:val="lowerRoman"/>
+      <w:lvlText w:val="%9."/>
+      <w:lvlJc w:val="right"/>
+      <w:pPr>
+        <w:ind w:left="6480" w:hanging="180"/>
+      </w:pPr>
+    </w:lvl>
+  </w:abstractNum>
+  <w:num w:numId="1" w16cid:durableId="1301886864">
+    <w:abstractNumId w:val="0"/>
+  </w:num>
+</w:numbering>
 </file>
 
 <file path=word/styles.xml><?xml version="1.0" encoding="utf-8"?>
@@ -419,10 +579,52 @@
     <w:name w:val="Normal"/>
     <w:qFormat/>
   </w:style>
+  <w:style w:type="paragraph" w:styleId="Heading1">
+    <w:name w:val="heading 1"/>
+    <w:basedOn w:val="Normal"/>
+    <w:next w:val="Normal"/>
+    <w:link w:val="Heading1Char"/>
+    <w:uiPriority w:val="9"/>
+    <w:qFormat/>
+    <w:rsid w:val="00027296"/>
+    <w:pPr>
+      <w:keepNext/>
+      <w:keepLines/>
+      <w:spacing w:before="240" w:after="0"/>
+      <w:outlineLvl w:val="0"/>
+    </w:pPr>
+    <w:rPr>
+      <w:rFonts w:asciiTheme="majorHAnsi" w:eastAsiaTheme="majorEastAsia" w:hAnsiTheme="majorHAnsi" w:cstheme="majorBidi"/>
+      <w:color w:val="2F5496" w:themeColor="accent1" w:themeShade="BF"/>
+      <w:sz w:val="32"/>
+      <w:szCs w:val="32"/>
+    </w:rPr>
+  </w:style>
+  <w:style w:type="paragraph" w:styleId="Heading2">
+    <w:name w:val="heading 2"/>
+    <w:basedOn w:val="Normal"/>
+    <w:next w:val="Normal"/>
+    <w:link w:val="Heading2Char"/>
+    <w:uiPriority w:val="9"/>
+    <w:unhideWhenUsed/>
+    <w:qFormat/>
+    <w:rsid w:val="00027296"/>
+    <w:pPr>
+      <w:keepNext/>
+      <w:keepLines/>
+      <w:spacing w:before="40" w:after="0"/>
+      <w:outlineLvl w:val="1"/>
+    </w:pPr>
+    <w:rPr>
+      <w:rFonts w:asciiTheme="majorHAnsi" w:eastAsiaTheme="majorEastAsia" w:hAnsiTheme="majorHAnsi" w:cstheme="majorBidi"/>
+      <w:color w:val="2F5496" w:themeColor="accent1" w:themeShade="BF"/>
+      <w:sz w:val="26"/>
+      <w:szCs w:val="26"/>
+    </w:rPr>
+  </w:style>
   <w:style w:type="character" w:default="1" w:styleId="DefaultParagraphFont">
     <w:name w:val="Default Paragraph Font"/>
     <w:uiPriority w:val="1"/>
-    <w:semiHidden/>
     <w:unhideWhenUsed/>
   </w:style>
   <w:style w:type="table" w:default="1" w:styleId="TableNormal">
@@ -445,6 +647,43 @@
     <w:uiPriority w:val="99"/>
     <w:semiHidden/>
     <w:unhideWhenUsed/>
+  </w:style>
+  <w:style w:type="character" w:customStyle="1" w:styleId="Heading1Char">
+    <w:name w:val="Heading 1 Char"/>
+    <w:basedOn w:val="DefaultParagraphFont"/>
+    <w:link w:val="Heading1"/>
+    <w:uiPriority w:val="9"/>
+    <w:rsid w:val="00027296"/>
+    <w:rPr>
+      <w:rFonts w:asciiTheme="majorHAnsi" w:eastAsiaTheme="majorEastAsia" w:hAnsiTheme="majorHAnsi" w:cstheme="majorBidi"/>
+      <w:color w:val="2F5496" w:themeColor="accent1" w:themeShade="BF"/>
+      <w:sz w:val="32"/>
+      <w:szCs w:val="32"/>
+    </w:rPr>
+  </w:style>
+  <w:style w:type="paragraph" w:styleId="ListParagraph">
+    <w:name w:val="List Paragraph"/>
+    <w:basedOn w:val="Normal"/>
+    <w:uiPriority w:val="34"/>
+    <w:qFormat/>
+    <w:rsid w:val="00027296"/>
+    <w:pPr>
+      <w:ind w:left="720"/>
+      <w:contextualSpacing/>
+    </w:pPr>
+  </w:style>
+  <w:style w:type="character" w:customStyle="1" w:styleId="Heading2Char">
+    <w:name w:val="Heading 2 Char"/>
+    <w:basedOn w:val="DefaultParagraphFont"/>
+    <w:link w:val="Heading2"/>
+    <w:uiPriority w:val="9"/>
+    <w:rsid w:val="00027296"/>
+    <w:rPr>
+      <w:rFonts w:asciiTheme="majorHAnsi" w:eastAsiaTheme="majorEastAsia" w:hAnsiTheme="majorHAnsi" w:cstheme="majorBidi"/>
+      <w:color w:val="2F5496" w:themeColor="accent1" w:themeShade="BF"/>
+      <w:sz w:val="26"/>
+      <w:szCs w:val="26"/>
+    </w:rPr>
   </w:style>
 </w:styles>
 </file>

</xml_diff>